<commit_message>
Rewrite portfolio and CV around results and client work
Lead with measured outcomes (website monitor replacing ~40 min/day of
manual checks, gateway ClickUp and security-alert wins), direct client
involvement, and verifying things work instead of assuming. Remove
MarketPulse and the named NHC and Flint Studios references, move
Vantage Point under AI systems with its custom agent loop as the focus,
and mark the undeployed gateway agents as awaiting rollout. Regenerate
the CV PDF (still 2 pages) and add business readers to PRODUCT.md.

Co-Authored-By: Claude Opus 5 <noreply@anthropic.com>
Claude-Session: https://claude.ai/code/session_01AktHfcJFGi6rno38Uo7LaN
</commit_message>
<xml_diff>
--- a/assets/cv/David_Hill_CV.docx
+++ b/assets/cv/David_Hill_CV.docx
@@ -425,7 +425,7 @@
                 <w:sz w:val="16"/>
                 <w:szCs w:val="16"/>
               </w:rPr>
-              <w:t xml:space="preserve">English — Native</w:t>
+              <w:t>English (Native)</w:t>
             </w:r>
           </w:p>
           <w:p>
@@ -543,7 +543,7 @@
                 <w:sz w:val="17"/>
                 <w:szCs w:val="17"/>
               </w:rPr>
-              <w:t>AI engineer with hands-on experience building multi-agent AI systems and LLM-based applications. Designs system architecture and agent behaviour, then stays hands-on through code review, debugging and production testing rather than handing that off. Self-hosts a personal multi-agent AI stack for daily use, and led the deployment of a production multi-agent system for a client workforce. Writing code with AI tools since 2022, from early manual prompt loops through to agentic development today.</w:t>
+              <w:t>I build automation and AI systems, and I don't call them done until I've proven they work. At Neozeit I'm the front person on almost all of my development work. I run the requirements meetings with the client, build the system, and handle the training and support afterwards. I test the limits I put on AI agents instead of trusting them, and I check migrations with real users before signing them off. I've been building with AI tools since 2022.</w:t>
             </w:r>
           </w:p>
           <w:p>
@@ -600,187 +600,187 @@
                 <w:sz w:val="16"/>
                 <w:szCs w:val="16"/>
               </w:rPr>
-              <w:t xml:space="preserve">IT Engineer — Development &amp; Automation</w:t>
-            </w:r>
-          </w:p>
-          <w:p>
-            <w:pPr>
-              <w:pStyle w:val="ListParagraph"/>
-              <w:numPr>
-                <w:ilvl w:val="0"/>
-                <w:numId w:val="2"/>
-              </w:numPr>
-              <w:spacing w:after="60" w:line="250"/>
-            </w:pPr>
-            <w:r>
-              <w:rPr>
-                <w:color w:val="444444"/>
-                <w:sz w:val="17"/>
-                <w:szCs w:val="17"/>
-              </w:rPr>
-              <w:t>Led the design and deployment of a multi-agent AI automation system (OpenClaw) for a two-company client workforce, integrating MemPalace (open source) for persistent agent memory.</w:t>
-            </w:r>
-          </w:p>
-          <w:p>
-            <w:pPr>
-              <w:pStyle w:val="ListParagraph"/>
-              <w:numPr>
-                <w:ilvl w:val="0"/>
-                <w:numId w:val="2"/>
-              </w:numPr>
-              <w:spacing w:after="60" w:line="250"/>
-            </w:pPr>
-            <w:r>
-              <w:rPr>
-                <w:color w:val="444444"/>
-                <w:sz w:val="17"/>
-                <w:szCs w:val="17"/>
-              </w:rPr>
-              <w:t xml:space="preserve">Designed a tiered model-delegation strategy for cost control across the agent fleet: reasoning models for planning and judgment, lightweight models for mechanical execution, and direct scripts for bulk data work.</w:t>
-            </w:r>
-          </w:p>
-          <w:p>
-            <w:pPr>
-              <w:pStyle w:val="ListParagraph"/>
-              <w:numPr>
-                <w:ilvl w:val="0"/>
-                <w:numId w:val="2"/>
-              </w:numPr>
-              <w:spacing w:after="60" w:line="250"/>
-            </w:pPr>
-            <w:r>
-              <w:rPr>
-                <w:color w:val="444444"/>
-                <w:sz w:val="17"/>
-                <w:szCs w:val="17"/>
-              </w:rPr>
-              <w:t>Built a custom ClickUp MCP server (TypeScript) using Anthropic’s MCP builder skill, since the official ClickUp MCP server doesn’t support OpenClaw; integrated it into the client’s production agent.</w:t>
-            </w:r>
-          </w:p>
-          <w:p>
-            <w:pPr>
-              <w:pStyle w:val="ListParagraph"/>
-              <w:numPr>
-                <w:ilvl w:val="0"/>
-                <w:numId w:val="2"/>
-              </w:numPr>
-              <w:spacing w:after="60" w:line="250"/>
-            </w:pPr>
-            <w:r>
-              <w:rPr>
-                <w:color w:val="444444"/>
-                <w:sz w:val="17"/>
-                <w:szCs w:val="17"/>
-              </w:rPr>
-              <w:t>Built and deployed production web applications for clients, including a financial market dashboard with automated Telegram delivery (see MarketPulse below).</w:t>
-            </w:r>
-          </w:p>
-          <w:p>
-            <w:pPr>
-              <w:pStyle w:val="ListParagraph"/>
-              <w:numPr>
-                <w:ilvl w:val="0"/>
-                <w:numId w:val="2"/>
-              </w:numPr>
-              <w:spacing w:after="60" w:line="250"/>
-            </w:pPr>
-            <w:r>
-              <w:rPr>
-                <w:color w:val="444444"/>
-                <w:sz w:val="17"/>
-                <w:szCs w:val="17"/>
-              </w:rPr>
-              <w:t>Developed and maintain a financial market dashboard for a financial advisory practice, with automated Telegram delivery of daily updates using a custom Telegram bot.</w:t>
-            </w:r>
-          </w:p>
-          <w:p>
-            <w:pPr>
-              <w:pStyle w:val="ListParagraph"/>
-              <w:numPr>
-                <w:ilvl w:val="0"/>
-                <w:numId w:val="2"/>
-              </w:numPr>
-              <w:spacing w:after="60" w:line="250"/>
-            </w:pPr>
-            <w:r>
-              <w:rPr>
-                <w:color w:val="444444"/>
-                <w:sz w:val="17"/>
-                <w:szCs w:val="17"/>
-              </w:rPr>
-              <w:t>Infrastructure and support administration across Neozeit's SME client portfolio, including Microsoft 365, Active Directory, and Proxmox VE cluster management.</w:t>
-            </w:r>
-          </w:p>
-          <w:p>
-            <w:pPr>
-              <w:pStyle w:val="ListParagraph"/>
-              <w:numPr>
-                <w:ilvl w:val="0"/>
-                <w:numId w:val="2"/>
-              </w:numPr>
-              <w:spacing w:after="60" w:line="250"/>
-            </w:pPr>
-            <w:r>
-              <w:rPr>
-                <w:color w:val="444444"/>
-                <w:sz w:val="17"/>
-                <w:szCs w:val="17"/>
-              </w:rPr>
-              <w:t xml:space="preserve">Sole operator of Neozeit's Proxmox VE infrastructure (3-node cluster, 12-drive RAID6 backup server, LTO-4 tape rotation, managed Avaya switch).</w:t>
-            </w:r>
-          </w:p>
-          <w:p>
-            <w:pPr>
-              <w:pStyle w:val="ListParagraph"/>
-              <w:numPr>
-                <w:ilvl w:val="0"/>
-                <w:numId w:val="2"/>
-              </w:numPr>
-              <w:spacing w:after="60" w:line="250"/>
-            </w:pPr>
-            <w:r>
-              <w:rPr>
-                <w:color w:val="444444"/>
-                <w:sz w:val="17"/>
-                <w:szCs w:val="17"/>
-              </w:rPr>
-              <w:t xml:space="preserve">Built and configured a Windows Server 2025 VM on Neozeit's Proxmox infrastructure for a medical client, including networking and user/group setup, then migrated all of the client's company data sets onto it and validated end-to-end that users could log in and work; an external vendor handled the Pastel application install and licensing.</w:t>
-            </w:r>
-          </w:p>
-          <w:p>
-            <w:pPr>
-              <w:pStyle w:val="ListParagraph"/>
-              <w:numPr>
-                <w:ilvl w:val="0"/>
-                <w:numId w:val="2"/>
-              </w:numPr>
-              <w:spacing w:after="60" w:line="250"/>
-            </w:pPr>
-            <w:r>
-              <w:rPr>
-                <w:color w:val="444444"/>
-                <w:sz w:val="17"/>
-                <w:szCs w:val="17"/>
-              </w:rPr>
-              <w:t xml:space="preserve">Built shell-script automation for update and patch management across a client’s macOS fleet of roughly 160 devices.</w:t>
-            </w:r>
-          </w:p>
-          <w:p>
-            <w:pPr>
-              <w:pStyle w:val="ListParagraph"/>
-              <w:numPr>
-                <w:ilvl w:val="0"/>
-                <w:numId w:val="2"/>
-              </w:numPr>
-              <w:spacing w:after="60" w:line="250"/>
-            </w:pPr>
-            <w:r>
-              <w:rPr>
-                <w:color w:val="444444"/>
-                <w:sz w:val="17"/>
-                <w:szCs w:val="17"/>
-              </w:rPr>
-              <w:t xml:space="preserve">Promoted from Junior to IT Engineer after 4 months, recognised for operating consistently above entry level across all project areas.</w:t>
+              <w:t>IT Engineer, Development &amp; Automation</w:t>
+            </w:r>
+          </w:p>
+          <w:p>
+            <w:pPr>
+              <w:pStyle w:val="ListParagraph"/>
+              <w:numPr>
+                <w:ilvl w:val="0"/>
+                <w:numId w:val="2"/>
+              </w:numPr>
+              <w:spacing w:after="60" w:line="250"/>
+            </w:pPr>
+            <w:r>
+              <w:rPr>
+                <w:color w:val="444444"/>
+                <w:sz w:val="17"/>
+                <w:szCs w:val="17"/>
+              </w:rPr>
+              <w:t>Main point of contact for clients on my development projects, covering requirements meetings, handover, staff training and on-site support.</w:t>
+            </w:r>
+          </w:p>
+          <w:p>
+            <w:pPr>
+              <w:pStyle w:val="ListParagraph"/>
+              <w:numPr>
+                <w:ilvl w:val="0"/>
+                <w:numId w:val="2"/>
+              </w:numPr>
+              <w:spacing w:after="60" w:line="250"/>
+            </w:pPr>
+            <w:r>
+              <w:rPr>
+                <w:color w:val="444444"/>
+                <w:sz w:val="17"/>
+                <w:szCs w:val="17"/>
+              </w:rPr>
+              <w:t>Led the design and deployment of a multi-agent AI system (OpenClaw) for two client companies sharing an office. Its project management agent handles ClickUp task creation, assignment, status updates and summaries from Slack. It also ranks website vulnerability alerts by severity, so they now get read and forwarded to the team.</w:t>
+            </w:r>
+          </w:p>
+          <w:p>
+            <w:pPr>
+              <w:pStyle w:val="ListParagraph"/>
+              <w:numPr>
+                <w:ilvl w:val="0"/>
+                <w:numId w:val="2"/>
+              </w:numPr>
+              <w:spacing w:after="60" w:line="250"/>
+            </w:pPr>
+            <w:r>
+              <w:rPr>
+                <w:color w:val="444444"/>
+                <w:sz w:val="17"/>
+                <w:szCs w:val="17"/>
+              </w:rPr>
+              <w:t>Built a custom ClickUp MCP server in TypeScript after finding the official one didn't support OpenClaw, and put it into the client's production agent.</w:t>
+            </w:r>
+          </w:p>
+          <w:p>
+            <w:pPr>
+              <w:pStyle w:val="ListParagraph"/>
+              <w:numPr>
+                <w:ilvl w:val="0"/>
+                <w:numId w:val="2"/>
+              </w:numPr>
+              <w:spacing w:after="60" w:line="250"/>
+            </w:pPr>
+            <w:r>
+              <w:rPr>
+                <w:color w:val="444444"/>
+                <w:sz w:val="17"/>
+                <w:szCs w:val="17"/>
+              </w:rPr>
+              <w:t>Set up tiered model use to keep costs down: reasoning models for planning and judgement, lighter models for routine execution, and plain scripts for bulk data work.</w:t>
+            </w:r>
+          </w:p>
+          <w:p>
+            <w:pPr>
+              <w:pStyle w:val="ListParagraph"/>
+              <w:numPr>
+                <w:ilvl w:val="0"/>
+                <w:numId w:val="2"/>
+              </w:numPr>
+              <w:spacing w:after="60" w:line="250"/>
+            </w:pPr>
+            <w:r>
+              <w:rPr>
+                <w:color w:val="444444"/>
+                <w:sz w:val="17"/>
+                <w:szCs w:val="17"/>
+              </w:rPr>
+              <w:t>Built an automated monitor for a medical client's website and patient booking flow, replacing about 40 minutes a day of manual checks. In its first months it caught several real issues, including a broken booking flow, page outages and data cleanup failures.</w:t>
+            </w:r>
+          </w:p>
+          <w:p>
+            <w:pPr>
+              <w:pStyle w:val="ListParagraph"/>
+              <w:numPr>
+                <w:ilvl w:val="0"/>
+                <w:numId w:val="2"/>
+              </w:numPr>
+              <w:spacing w:after="60" w:line="250"/>
+            </w:pPr>
+            <w:r>
+              <w:rPr>
+                <w:color w:val="444444"/>
+                <w:sz w:val="17"/>
+                <w:szCs w:val="17"/>
+              </w:rPr>
+              <w:t>Sole operator of Neozeit's Proxmox VE infrastructure (3-node cluster, 12-drive RAID6 backup server, LTO-4 tape rotation, managed Avaya switch). Built the cluster from scratch with no prior Proxmox experience and moved existing production VMs onto it while they stayed in use. Resolved a RAID storage issue on the backup server on my own with no data lost.</w:t>
+            </w:r>
+          </w:p>
+          <w:p>
+            <w:pPr>
+              <w:pStyle w:val="ListParagraph"/>
+              <w:numPr>
+                <w:ilvl w:val="0"/>
+                <w:numId w:val="2"/>
+              </w:numPr>
+              <w:spacing w:after="60" w:line="250"/>
+            </w:pPr>
+            <w:r>
+              <w:rPr>
+                <w:color w:val="444444"/>
+                <w:sz w:val="17"/>
+                <w:szCs w:val="17"/>
+              </w:rPr>
+              <w:t>Built and configured a Windows Server 2025 VM on Neozeit's Proxmox infrastructure for a medical client, including networking and user/group setup. Migrated all of the client's company data onto it and confirmed that users could log in and do their normal work before signing it off. An external vendor handled the Pastel install and licensing.</w:t>
+            </w:r>
+          </w:p>
+          <w:p>
+            <w:pPr>
+              <w:pStyle w:val="ListParagraph"/>
+              <w:numPr>
+                <w:ilvl w:val="0"/>
+                <w:numId w:val="2"/>
+              </w:numPr>
+              <w:spacing w:after="60" w:line="250"/>
+            </w:pPr>
+            <w:r>
+              <w:rPr>
+                <w:color w:val="444444"/>
+                <w:sz w:val="17"/>
+                <w:szCs w:val="17"/>
+              </w:rPr>
+              <w:t>Infrastructure and support administration across Neozeit's SME clients, including Microsoft 365 and Active Directory.</w:t>
+            </w:r>
+          </w:p>
+          <w:p>
+            <w:pPr>
+              <w:pStyle w:val="ListParagraph"/>
+              <w:numPr>
+                <w:ilvl w:val="0"/>
+                <w:numId w:val="2"/>
+              </w:numPr>
+              <w:spacing w:after="60" w:line="250"/>
+            </w:pPr>
+            <w:r>
+              <w:rPr>
+                <w:color w:val="444444"/>
+                <w:sz w:val="17"/>
+                <w:szCs w:val="17"/>
+              </w:rPr>
+              <w:t>Built shell-script automation for update and patch management across a client's macOS fleet of roughly 160 devices.</w:t>
+            </w:r>
+          </w:p>
+          <w:p>
+            <w:pPr>
+              <w:pStyle w:val="ListParagraph"/>
+              <w:numPr>
+                <w:ilvl w:val="0"/>
+                <w:numId w:val="2"/>
+              </w:numPr>
+              <w:spacing w:after="60" w:line="250"/>
+            </w:pPr>
+            <w:r>
+              <w:rPr>
+                <w:color w:val="444444"/>
+                <w:sz w:val="17"/>
+                <w:szCs w:val="17"/>
+              </w:rPr>
+              <w:t>Promoted from Junior to IT Engineer after 4 months.</w:t>
             </w:r>
           </w:p>
           <w:p>
@@ -984,7 +984,7 @@
                 <w:sz w:val="16"/>
                 <w:szCs w:val="16"/>
               </w:rPr>
-              <w:t xml:space="preserve">Intern — Technical Administrator</w:t>
+              <w:t>Intern, Technical Administrator</w:t>
             </w:r>
           </w:p>
           <w:p>
@@ -1021,24 +1021,6 @@
                 <w:szCs w:val="17"/>
               </w:rPr>
               <w:t xml:space="preserve">Assisted account managers by contacting clients and communicating product and package benefits.</w:t>
-            </w:r>
-          </w:p>
-          <w:p>
-            <w:pPr>
-              <w:pStyle w:val="ListParagraph"/>
-              <w:numPr>
-                <w:ilvl w:val="0"/>
-                <w:numId w:val="2"/>
-              </w:numPr>
-              <w:spacing w:after="60" w:line="250"/>
-            </w:pPr>
-            <w:r>
-              <w:rPr>
-                <w:color w:val="444444"/>
-                <w:sz w:val="17"/>
-                <w:szCs w:val="17"/>
-              </w:rPr>
-              <w:t xml:space="preserve">Gained foundational exposure to cybersecurity tooling and the vendor ecosystem, directly informing later Kaspersky and Barracuda certifications.</w:t>
             </w:r>
           </w:p>
           <w:p>
@@ -1128,7 +1110,7 @@
                 <w:sz w:val="17"/>
                 <w:szCs w:val="17"/>
               </w:rPr>
-              <w:t>Multi-Tenant AI Gateway — Authorised Client Deployment</w:t>
+              <w:t>Multi-Tenant AI Gateway · Authorised Client Deployment</w:t>
             </w:r>
           </w:p>
           <w:p>
@@ -1142,7 +1124,7 @@
                 <w:sz w:val="17"/>
                 <w:szCs w:val="17"/>
               </w:rPr>
-              <w:t>Multi-agent deployment on OpenClaw for two independent client companies sharing one gateway: an Orchestrator, a live production PM/admin-support agent (Jeeves), and two department agents built and tool-scoped, currently paused for rollout. Each agent's tools and memory access are scoped to its role and tenant; that scoping is reviewed and tightened on an ongoing basis rather than treated as solved. Department agents report to the client teams that own the work, not back through the operator. Ongoing development and maintenance.</w:t>
+              <w:t>Multi-agent deployment on OpenClaw for two client companies sharing one gateway: a live Orchestrator, a live project management agent (Jeeves), and two department agents that are built and waiting for rollout. Jeeves handles ClickUp work from Slack and turns website vulnerability alerts into severity-ranked summaries. Each agent's tools and memory are limited to its role and company, and I keep testing those limits.</w:t>
             </w:r>
           </w:p>
           <w:p>
@@ -1157,7 +1139,7 @@
                 <w:sz w:val="17"/>
                 <w:szCs w:val="17"/>
               </w:rPr>
-              <w:t>Personal AI Stack — Self-Hosted Personal Project</w:t>
+              <w:t>Personal AI Stack · Self-Hosted Personal Project</w:t>
             </w:r>
           </w:p>
           <w:p>
@@ -1186,7 +1168,7 @@
                 <w:sz w:val="17"/>
                 <w:szCs w:val="17"/>
               </w:rPr>
-              <w:t>NHC Inspection &amp; Monitoring Pipeline — Authorised Client Work</w:t>
+              <w:t>Website &amp; Booking Monitor · Medical Client</w:t>
             </w:r>
           </w:p>
           <w:p>
@@ -1200,7 +1182,7 @@
                 <w:sz w:val="17"/>
                 <w:szCs w:val="17"/>
               </w:rPr>
-              <w:t>Built and operate an automated inspection pipeline for NHC's public website and patient portal. Runs scheduled checks against key public pages and a full appointment-booking flow, verifies cleanup afterward, captures diagnostic evidence, and delivers structured status reports twice daily, with failures classified by affected stage, likely owner, and recommended next action.</w:t>
+              <w:t>Automated monitor for a medical client's public website and patient booking system. Twice a day it loads the main pages, makes a test booking all the way through, checks the booking gets cleaned up, and sends a report that says which step failed and who needs to fix it. It replaced about 40 minutes a day of manual checks and caught several real issues in its first months.</w:t>
             </w:r>
           </w:p>
           <w:p>
@@ -1215,7 +1197,7 @@
                 <w:sz w:val="17"/>
                 <w:szCs w:val="17"/>
               </w:rPr>
-              <w:t>MarketPulse — Anonymised Beta/Client Demo</w:t>
+              <w:t>Vantage Point · Anonymised Client Demo</w:t>
             </w:r>
           </w:p>
           <w:p>
@@ -1229,7 +1211,7 @@
                 <w:sz w:val="17"/>
                 <w:szCs w:val="17"/>
               </w:rPr>
-              <w:t>Daily market-briefing dashboard for a financial advisory practice: pulls index, forex and commodity data plus regional news, then sends a formatted briefing to Telegram from one button. Rebuilt from a single-file prototype into a full React and Express stack without changing how the advisors use it day to day.</w:t>
+              <w:t>Competitive-intelligence dashboard for a cybersecurity vendor, with an AI-filtered news feed, a competitor tracker, a content writer and an outreach CRM behind one login. All AI features run through a custom ReAct-style agent loop I wrote directly against the Anthropic Messages API, with no framework. In the client build, each reasoning step and tool call streams live. React, TypeScript, Fastify, Prisma, PostgreSQL. The public demo is frontend only and runs on sample data.</w:t>
             </w:r>
           </w:p>
           <w:p>
@@ -1244,36 +1226,7 @@
                 <w:sz w:val="17"/>
                 <w:szCs w:val="17"/>
               </w:rPr>
-              <w:t>Vantage Point — Anonymised Beta/Client Demo</w:t>
-            </w:r>
-          </w:p>
-          <w:p>
-            <w:pPr>
-              <w:spacing w:after="90" w:line="250"/>
-              <w:jc w:val="left"/>
-            </w:pPr>
-            <w:r>
-              <w:rPr>
-                <w:color w:val="444444"/>
-                <w:sz w:val="17"/>
-                <w:szCs w:val="17"/>
-              </w:rPr>
-              <w:t>Competitive-intelligence dashboard for a cybersecurity vendor: an AI-curated news feed, a competitor tracker, a content generator and a lightweight outreach CRM behind one login. Styled like a cyber-terminal on purpose, since the client's own product is a security tool. React, TypeScript, Fastify, Prisma, PostgreSQL, Anthropic Messages API. Live as an anonymised public demo.</w:t>
-            </w:r>
-          </w:p>
-          <w:p>
-            <w:pPr>
-              <w:spacing w:after="50" w:before="150"/>
-            </w:pPr>
-            <w:r>
-              <w:rPr>
-                <w:b/>
-                <w:bCs/>
-                <w:color w:val="1F3552"/>
-                <w:sz w:val="17"/>
-                <w:szCs w:val="17"/>
-              </w:rPr>
-              <w:t>HillSkills.co.za — Public Production Site</w:t>
+              <w:t>HillSkills.co.za · Public Production Site</w:t>
             </w:r>
           </w:p>
           <w:p>

</xml_diff>

<commit_message>
Align CV with code and target dev roles
Narrow the Vantage Point and Personal AI Stack claims to what the code
and README support, add the mapping platform and market briefing
projects, lead the skills list with the dev stack, and condense the
infrastructure bullets.

Co-Authored-By: Claude Opus 5.5 <noreply@anthropic.com>
</commit_message>
<xml_diff>
--- a/assets/cv/David_Hill_CV.docx
+++ b/assets/cv/David_Hill_CV.docx
@@ -31,7 +31,7 @@
           <w:sz w:val="19"/>
           <w:szCs w:val="19"/>
         </w:rPr>
-        <w:t>AI Automation &amp; Development</w:t>
+        <w:t>AI, Automation &amp; Full-Stack Development</w:t>
       </w:r>
     </w:p>
     <w:tbl>
@@ -158,7 +158,7 @@
                 <w:sz w:val="16"/>
                 <w:szCs w:val="16"/>
               </w:rPr>
-              <w:t xml:space="preserve">Johannesburg</w:t>
+              <w:t>Johannesburg, relocating to Cape Town</w:t>
             </w:r>
           </w:p>
           <w:p>
@@ -256,37 +256,67 @@
                 <w:sz w:val="16"/>
                 <w:szCs w:val="16"/>
               </w:rPr>
-              <w:t>Multi-Agent AI Systems (OpenClaw)</w:t>
-            </w:r>
-          </w:p>
-          <w:p>
-            <w:pPr>
-              <w:spacing w:after="40"/>
-            </w:pPr>
-            <w:r>
-              <w:rPr>
-                <w:b w:val="false"/>
-                <w:bCs w:val="false"/>
-                <w:color w:val="444444"/>
-                <w:sz w:val="16"/>
-                <w:szCs w:val="16"/>
-              </w:rPr>
-              <w:t>Agentic System Architecture</w:t>
-            </w:r>
-          </w:p>
-          <w:p>
-            <w:pPr>
-              <w:spacing w:after="40"/>
-            </w:pPr>
-            <w:r>
-              <w:rPr>
-                <w:b w:val="false"/>
-                <w:bCs w:val="false"/>
-                <w:color w:val="444444"/>
-                <w:sz w:val="16"/>
-                <w:szCs w:val="16"/>
-              </w:rPr>
-              <w:t>MCP (Model Context Protocol)</w:t>
+              <w:t>TypeScript, JavaScript &amp; Python</w:t>
+            </w:r>
+          </w:p>
+          <w:p>
+            <w:pPr>
+              <w:spacing w:after="40"/>
+            </w:pPr>
+            <w:r>
+              <w:rPr>
+                <w:b w:val="false"/>
+                <w:bCs w:val="false"/>
+                <w:color w:val="444444"/>
+                <w:sz w:val="16"/>
+                <w:szCs w:val="16"/>
+              </w:rPr>
+              <w:t>React, Node.js, Express &amp; Fastify</w:t>
+            </w:r>
+          </w:p>
+          <w:p>
+            <w:pPr>
+              <w:spacing w:after="40"/>
+            </w:pPr>
+            <w:r>
+              <w:rPr>
+                <w:b w:val="false"/>
+                <w:bCs w:val="false"/>
+                <w:color w:val="444444"/>
+                <w:sz w:val="16"/>
+                <w:szCs w:val="16"/>
+              </w:rPr>
+              <w:t>PostgreSQL, MariaDB, Prisma &amp; Sequelize</w:t>
+            </w:r>
+          </w:p>
+          <w:p>
+            <w:pPr>
+              <w:spacing w:after="40"/>
+            </w:pPr>
+            <w:r>
+              <w:rPr>
+                <w:b w:val="false"/>
+                <w:bCs w:val="false"/>
+                <w:color w:val="444444"/>
+                <w:sz w:val="16"/>
+                <w:szCs w:val="16"/>
+              </w:rPr>
+              <w:t>Anthropic API / Claude &amp; LLM Integration</w:t>
+            </w:r>
+          </w:p>
+          <w:p>
+            <w:pPr>
+              <w:spacing w:after="40"/>
+            </w:pPr>
+            <w:r>
+              <w:rPr>
+                <w:b w:val="false"/>
+                <w:bCs w:val="false"/>
+                <w:color w:val="444444"/>
+                <w:sz w:val="16"/>
+                <w:szCs w:val="16"/>
+              </w:rPr>
+              <w:t>Agent Loops &amp; Tool Use</w:t>
             </w:r>
           </w:p>
           <w:p>
@@ -316,82 +346,52 @@
                 <w:sz w:val="16"/>
                 <w:szCs w:val="16"/>
               </w:rPr>
-              <w:t>LLM Integration &amp; Prompt Engineering</w:t>
-            </w:r>
-          </w:p>
-          <w:p>
-            <w:pPr>
-              <w:spacing w:after="40"/>
-            </w:pPr>
-            <w:r>
-              <w:rPr>
-                <w:b w:val="false"/>
-                <w:bCs w:val="false"/>
-                <w:color w:val="444444"/>
-                <w:sz w:val="16"/>
-                <w:szCs w:val="16"/>
-              </w:rPr>
-              <w:t>AI Application Development</w:t>
-            </w:r>
-          </w:p>
-          <w:p>
-            <w:pPr>
-              <w:spacing w:after="40"/>
-            </w:pPr>
-            <w:r>
-              <w:rPr>
-                <w:b w:val="false"/>
-                <w:bCs w:val="false"/>
-                <w:color w:val="444444"/>
-                <w:sz w:val="16"/>
-                <w:szCs w:val="16"/>
-              </w:rPr>
-              <w:t>Anthropic API / Claude, OpenAI Codex</w:t>
-            </w:r>
-          </w:p>
-          <w:p>
-            <w:pPr>
-              <w:spacing w:after="40"/>
-            </w:pPr>
-            <w:r>
-              <w:rPr>
-                <w:b w:val="false"/>
-                <w:bCs w:val="false"/>
-                <w:color w:val="444444"/>
-                <w:sz w:val="16"/>
-                <w:szCs w:val="16"/>
-              </w:rPr>
-              <w:t xml:space="preserve">Python, JavaScript, TypeScript &amp; PowerShell</w:t>
-            </w:r>
-          </w:p>
-          <w:p>
-            <w:pPr>
-              <w:spacing w:after="40"/>
-            </w:pPr>
-            <w:r>
-              <w:rPr>
-                <w:b w:val="false"/>
-                <w:bCs w:val="false"/>
-                <w:color w:val="444444"/>
-                <w:sz w:val="16"/>
-                <w:szCs w:val="16"/>
-              </w:rPr>
-              <w:t xml:space="preserve">Node.js &amp; Playwright Automation</w:t>
-            </w:r>
-          </w:p>
-          <w:p>
-            <w:pPr>
-              <w:spacing w:after="40"/>
-            </w:pPr>
-            <w:r>
-              <w:rPr>
-                <w:b w:val="false"/>
-                <w:bCs w:val="false"/>
-                <w:color w:val="444444"/>
-                <w:sz w:val="16"/>
-                <w:szCs w:val="16"/>
-              </w:rPr>
-              <w:t xml:space="preserve">HTML, CSS &amp; API Integration</w:t>
+              <w:t>Multi-Agent Systems (OpenClaw)</w:t>
+            </w:r>
+          </w:p>
+          <w:p>
+            <w:pPr>
+              <w:spacing w:after="40"/>
+            </w:pPr>
+            <w:r>
+              <w:rPr>
+                <w:b w:val="false"/>
+                <w:bCs w:val="false"/>
+                <w:color w:val="444444"/>
+                <w:sz w:val="16"/>
+                <w:szCs w:val="16"/>
+              </w:rPr>
+              <w:t>Playwright Automation &amp; Monitoring</w:t>
+            </w:r>
+          </w:p>
+          <w:p>
+            <w:pPr>
+              <w:spacing w:after="40"/>
+            </w:pPr>
+            <w:r>
+              <w:rPr>
+                <w:b w:val="false"/>
+                <w:bCs w:val="false"/>
+                <w:color w:val="444444"/>
+                <w:sz w:val="16"/>
+                <w:szCs w:val="16"/>
+              </w:rPr>
+              <w:t>Docker, Git &amp; GitHub Actions</w:t>
+            </w:r>
+          </w:p>
+          <w:p>
+            <w:pPr>
+              <w:spacing w:after="40"/>
+            </w:pPr>
+            <w:r>
+              <w:rPr>
+                <w:b w:val="false"/>
+                <w:bCs w:val="false"/>
+                <w:color w:val="444444"/>
+                <w:sz w:val="16"/>
+                <w:szCs w:val="16"/>
+              </w:rPr>
+              <w:t>Linux, Proxmox VE &amp; PowerShell</w:t>
             </w:r>
           </w:p>
           <w:p>
@@ -543,7 +543,7 @@
                 <w:sz w:val="17"/>
                 <w:szCs w:val="17"/>
               </w:rPr>
-              <w:t>I build automation and AI systems, and I don't call them done until I've proven they work. At Neozeit I'm the front person on almost all of my development work. I run the requirements meetings with the client, build the system, and handle the training and support afterwards. I test the limits I put on AI agents instead of trusting them, and I check migrations with real users before signing them off. I've been building with AI tools since 2022.</w:t>
+              <w:t>I build AI systems, automation and full-stack web apps, and I don't call them done until I've proven they work. At Neozeit I'm the front person on almost all of my development work. I run the requirements meetings with the client, build the system, and handle the training and support afterwards. I test the limits I put on AI agents instead of trusting them. I've been building with AI tools since 2022.</w:t>
             </w:r>
           </w:p>
           <w:p>
@@ -708,43 +708,7 @@
                 <w:sz w:val="17"/>
                 <w:szCs w:val="17"/>
               </w:rPr>
-              <w:t>Sole operator of Neozeit's Proxmox VE infrastructure (3-node cluster, 12-drive RAID6 backup server, LTO-4 tape rotation, managed Avaya switch). Built the cluster from scratch with no prior Proxmox experience and moved existing production VMs onto it while they stayed in use. Resolved a RAID storage issue on the backup server on my own with no data lost.</w:t>
-            </w:r>
-          </w:p>
-          <w:p>
-            <w:pPr>
-              <w:pStyle w:val="ListParagraph"/>
-              <w:numPr>
-                <w:ilvl w:val="0"/>
-                <w:numId w:val="2"/>
-              </w:numPr>
-              <w:spacing w:after="60" w:line="250"/>
-            </w:pPr>
-            <w:r>
-              <w:rPr>
-                <w:color w:val="444444"/>
-                <w:sz w:val="17"/>
-                <w:szCs w:val="17"/>
-              </w:rPr>
-              <w:t>Built and configured a Windows Server 2025 VM on Neozeit's Proxmox infrastructure for a medical client, including networking and user/group setup. Migrated all of the client's company data onto it and confirmed that users could log in and do their normal work before signing it off. An external vendor handled the Pastel install and licensing.</w:t>
-            </w:r>
-          </w:p>
-          <w:p>
-            <w:pPr>
-              <w:pStyle w:val="ListParagraph"/>
-              <w:numPr>
-                <w:ilvl w:val="0"/>
-                <w:numId w:val="2"/>
-              </w:numPr>
-              <w:spacing w:after="60" w:line="250"/>
-            </w:pPr>
-            <w:r>
-              <w:rPr>
-                <w:color w:val="444444"/>
-                <w:sz w:val="17"/>
-                <w:szCs w:val="17"/>
-              </w:rPr>
-              <w:t>Infrastructure and support administration across Neozeit's SME clients, including Microsoft 365 and Active Directory.</w:t>
+              <w:t>Built and shipped full-stack web apps for clients, including a field-sales mapping platform (Express, MariaDB, Leaflet, offline PWA) and a market briefing dashboard (React, Express, TypeScript, PostgreSQL).</w:t>
             </w:r>
           </w:p>
           <w:p>
@@ -763,6 +727,42 @@
                 <w:szCs w:val="17"/>
               </w:rPr>
               <w:t>Built shell-script automation for update and patch management across a client's macOS fleet of roughly 160 devices.</w:t>
+            </w:r>
+          </w:p>
+          <w:p>
+            <w:pPr>
+              <w:pStyle w:val="ListParagraph"/>
+              <w:numPr>
+                <w:ilvl w:val="0"/>
+                <w:numId w:val="2"/>
+              </w:numPr>
+              <w:spacing w:after="60" w:line="250"/>
+            </w:pPr>
+            <w:r>
+              <w:rPr>
+                <w:color w:val="444444"/>
+                <w:sz w:val="17"/>
+                <w:szCs w:val="17"/>
+              </w:rPr>
+              <w:t>Sole operator of Neozeit's Proxmox VE infrastructure (3-node cluster, RAID6 backup server). Built the cluster from scratch with no prior Proxmox experience and moved production VMs onto it while they stayed in use.</w:t>
+            </w:r>
+          </w:p>
+          <w:p>
+            <w:pPr>
+              <w:pStyle w:val="ListParagraph"/>
+              <w:numPr>
+                <w:ilvl w:val="0"/>
+                <w:numId w:val="2"/>
+              </w:numPr>
+              <w:spacing w:after="60" w:line="250"/>
+            </w:pPr>
+            <w:r>
+              <w:rPr>
+                <w:color w:val="444444"/>
+                <w:sz w:val="17"/>
+                <w:szCs w:val="17"/>
+              </w:rPr>
+              <w:t>Other infrastructure work for Neozeit's SME clients includes a Windows Server 2025 migration for a medical client, Microsoft 365 and Active Directory.</w:t>
             </w:r>
           </w:p>
           <w:p>
@@ -1139,7 +1139,7 @@
                 <w:sz w:val="17"/>
                 <w:szCs w:val="17"/>
               </w:rPr>
-              <w:t>Personal AI Stack · Self-Hosted Personal Project</w:t>
+              <w:t>Vantage Point · Anonymised Client Demo</w:t>
             </w:r>
           </w:p>
           <w:p>
@@ -1153,7 +1153,7 @@
                 <w:sz w:val="17"/>
                 <w:szCs w:val="17"/>
               </w:rPr>
-              <w:t>Self-hosted multi-agent setup for personal research, planning and day-to-day automation, built on OpenClaw and running on OpenAI Codex. MemPalace (open source) handles agent memory; integrated it and added custom diary and checkpoint workflows on top. Each agent has its own scoped memory and toolset, actively maintained rather than assumed to be closed.</w:t>
+              <w:t>Competitive-intelligence dashboard for a cybersecurity vendor, with an AI-filtered news feed, a competitor tracker, a content writer and an outreach CRM behind one login. Competitor and company research runs through a ReAct-style agent loop I wrote directly against the Anthropic Messages API, with no framework, and each tool call and result streams to the browser live. The news summariser and content writer stream their output as it's generated. React, TypeScript, Fastify, Prisma, PostgreSQL. The public demo is frontend only and runs on sample data.</w:t>
             </w:r>
           </w:p>
           <w:p>
@@ -1197,7 +1197,7 @@
                 <w:sz w:val="17"/>
                 <w:szCs w:val="17"/>
               </w:rPr>
-              <w:t>Vantage Point · Anonymised Client Demo</w:t>
+              <w:t>Field-Sales Mapping Platform · Anonymised Client Work</w:t>
             </w:r>
           </w:p>
           <w:p>
@@ -1211,7 +1211,65 @@
                 <w:sz w:val="17"/>
                 <w:szCs w:val="17"/>
               </w:rPr>
-              <w:t>Competitive-intelligence dashboard for a cybersecurity vendor, with an AI-filtered news feed, a competitor tracker, a content writer and an outreach CRM behind one login. All AI features run through a custom ReAct-style agent loop I wrote directly against the Anthropic Messages API, with no framework. In the client build, each reasoning step and tool call streams live. React, TypeScript, Fastify, Prisma, PostgreSQL. The public demo is frontend only and runs on sample data.</w:t>
+              <w:t>Map of doctors, medical centres and rep territories for a healthcare sales team, with an admin dashboard, automated daily reports and a mobile PWA that queues changes offline and syncs when signal returns. Territory permissions are enforced on the server as well as in the browser. Node.js, Express, Sequelize, MariaDB and Leaflet, with TOTP 2FA and a React Native companion app.</w:t>
+            </w:r>
+          </w:p>
+          <w:p>
+            <w:pPr>
+              <w:spacing w:after="50" w:before="150"/>
+            </w:pPr>
+            <w:r>
+              <w:rPr>
+                <w:b/>
+                <w:bCs/>
+                <w:color w:val="1F3552"/>
+                <w:sz w:val="17"/>
+                <w:szCs w:val="17"/>
+              </w:rPr>
+              <w:t>Market Briefing Dashboard · Anonymised Client Work</w:t>
+            </w:r>
+          </w:p>
+          <w:p>
+            <w:pPr>
+              <w:spacing w:after="90" w:line="250"/>
+              <w:jc w:val="left"/>
+            </w:pPr>
+            <w:r>
+              <w:rPr>
+                <w:color w:val="444444"/>
+                <w:sz w:val="17"/>
+                <w:szCs w:val="17"/>
+              </w:rPr>
+              <w:t>Daily briefing tool for a financial advisory practice. It pulls market data and regional news, lets an operator review the articles, and sends a formatted briefing to the firm's Telegram channel. It started as a Flask prototype and I rebuilt it in React, Express, TypeScript and PostgreSQL with JWT and TOTP auth, Jest tests and GitHub Actions CI.</w:t>
+            </w:r>
+          </w:p>
+          <w:p>
+            <w:pPr>
+              <w:spacing w:after="50" w:before="150"/>
+            </w:pPr>
+            <w:r>
+              <w:rPr>
+                <w:b/>
+                <w:bCs/>
+                <w:color w:val="1F3552"/>
+                <w:sz w:val="17"/>
+                <w:szCs w:val="17"/>
+              </w:rPr>
+              <w:t>Personal AI Stack · Self-Hosted Personal Project</w:t>
+            </w:r>
+          </w:p>
+          <w:p>
+            <w:pPr>
+              <w:spacing w:after="90" w:line="250"/>
+              <w:jc w:val="left"/>
+            </w:pPr>
+            <w:r>
+              <w:rPr>
+                <w:color w:val="444444"/>
+                <w:sz w:val="17"/>
+                <w:szCs w:val="17"/>
+              </w:rPr>
+              <w:t>Self-hosted multi-agent setup for personal research, planning and day-to-day automation, built on OpenClaw. One agent runs on an OpenAI Codex subscription and two run on OpenRouter models. Memory is MemPalace (open source), with my own diary and checkpoint workflows on top. Each agent has its own scoped memory and toolset.</w:t>
             </w:r>
           </w:p>
           <w:p>
@@ -1295,7 +1353,7 @@
                 <w:sz w:val="17"/>
                 <w:szCs w:val="17"/>
               </w:rPr>
-              <w:t xml:space="preserve">Self-studied Python, JavaScript, HTML and CSS through hands-on project work.</w:t>
+              <w:t>Self-studied Python, JavaScript, TypeScript, HTML and CSS through hands-on project work.</w:t>
             </w:r>
           </w:p>
           <w:p>

</xml_diff>

<commit_message>
Tighten CV wording after review
Co-Authored-By: Claude Opus 5.5 <noreply@anthropic.com>
</commit_message>
<xml_diff>
--- a/assets/cv/David_Hill_CV.docx
+++ b/assets/cv/David_Hill_CV.docx
@@ -636,7 +636,7 @@
                 <w:sz w:val="17"/>
                 <w:szCs w:val="17"/>
               </w:rPr>
-              <w:t>Led the design and deployment of a multi-agent AI system (OpenClaw) for two client companies sharing an office. Its project management agent handles ClickUp task creation, assignment, status updates and summaries from Slack. It also ranks website vulnerability alerts by severity, so they now get read and forwarded to the team.</w:t>
+              <w:t>Led the design and deployment of a multi-agent AI system (OpenClaw) for two client companies sharing an office. Two agents are live and two more are built and waiting for rollout. The live project management agent handles ClickUp task creation, assignment, status updates and summaries from Slack. It also ranks website vulnerability alerts by severity, so they now get read and forwarded to the team.</w:t>
             </w:r>
           </w:p>
           <w:p>
@@ -744,7 +744,7 @@
                 <w:sz w:val="17"/>
                 <w:szCs w:val="17"/>
               </w:rPr>
-              <w:t>Sole operator of Neozeit's Proxmox VE infrastructure (3-node cluster, RAID6 backup server). Built the cluster from scratch with no prior Proxmox experience and moved production VMs onto it while they stayed in use.</w:t>
+              <w:t>Sole operator of Neozeit's Proxmox VE infrastructure (3-node cluster, RAID6 backup server). Built the cluster from scratch and moved production VMs onto it while they stayed in use.</w:t>
             </w:r>
           </w:p>
           <w:p>
@@ -1335,7 +1335,7 @@
                 <w:sz w:val="17"/>
                 <w:szCs w:val="17"/>
               </w:rPr>
-              <w:t>Began coding with AI assistance in 2022, using early-generation LLMs in a manual prompt-and-paste workflow before agentic coding tools existed. Now works regularly with modern AI development tooling including Claude Code and Cursor.</w:t>
+              <w:t>Began coding with AI assistance in 2022, using early-generation LLMs in a manual prompt-and-paste workflow. Now works regularly with modern AI development tooling including Claude Code and Cursor.</w:t>
             </w:r>
           </w:p>
           <w:p>

</xml_diff>

<commit_message>
Add client projects, host Vantage Point demo on Pages, sharpen CV claims
Adds the field-sales mapping and market briefing cards, serves the
Vantage Point demo from /vantage-point/ instead of the home server,
drops the dead source link, and updates the CV's monitor, model tier
and gateway wording with specifics.

Co-Authored-By: Claude Opus 5.5 <noreply@anthropic.com>
</commit_message>
<xml_diff>
--- a/assets/cv/David_Hill_CV.docx
+++ b/assets/cv/David_Hill_CV.docx
@@ -672,25 +672,25 @@
                 <w:sz w:val="17"/>
                 <w:szCs w:val="17"/>
               </w:rPr>
-              <w:t>Set up tiered model use to keep costs down: reasoning models for planning and judgement, lighter models for routine execution, and plain scripts for bulk data work.</w:t>
-            </w:r>
-          </w:p>
-          <w:p>
-            <w:pPr>
-              <w:pStyle w:val="ListParagraph"/>
-              <w:numPr>
-                <w:ilvl w:val="0"/>
-                <w:numId w:val="2"/>
-              </w:numPr>
-              <w:spacing w:after="60" w:line="250"/>
-            </w:pPr>
-            <w:r>
-              <w:rPr>
-                <w:color w:val="444444"/>
-                <w:sz w:val="17"/>
-                <w:szCs w:val="17"/>
-              </w:rPr>
-              <w:t>Built an automated monitor for a medical client's website and patient booking flow, replacing about 40 minutes a day of manual checks. In its first months it caught several real issues, including a broken booking flow, page outages and data cleanup failures.</w:t>
+              <w:t>Set up tiered model use to keep costs down: a stronger model (currently GPT-6 Sol) plans and reviews, a cheaper one (GPT-6 Luna) does routine execution and scheduled jobs, and plain scripts handle bulk data work. Models are set in gateway config, so changing provider didn't need a rebuild.</w:t>
+            </w:r>
+          </w:p>
+          <w:p>
+            <w:pPr>
+              <w:pStyle w:val="ListParagraph"/>
+              <w:numPr>
+                <w:ilvl w:val="0"/>
+                <w:numId w:val="2"/>
+              </w:numPr>
+              <w:spacing w:after="60" w:line="250"/>
+            </w:pPr>
+            <w:r>
+              <w:rPr>
+                <w:color w:val="444444"/>
+                <w:sz w:val="17"/>
+                <w:szCs w:val="17"/>
+              </w:rPr>
+              <w:t>Built an automated monitor in Python and Playwright for a medical client's website and patient booking flow, replacing about 40 minutes a day of manual checks. It regularly catches real issues on the booking platform, and has exposed inconsistent per-doctor settings in the platform's backend.</w:t>
             </w:r>
           </w:p>
           <w:p>
@@ -1124,7 +1124,7 @@
                 <w:sz w:val="17"/>
                 <w:szCs w:val="17"/>
               </w:rPr>
-              <w:t>Multi-agent deployment on OpenClaw for two client companies sharing one gateway: a live Orchestrator, a live project management agent (Jeeves), and two department agents that are built and waiting for rollout. Jeeves handles ClickUp work from Slack and turns website vulnerability alerts into severity-ranked summaries. Each agent's tools and memory are limited to its role and company, and I keep testing those limits.</w:t>
+              <w:t>Multi-agent deployment on OpenClaw for two client companies sharing one gateway: a live Orchestrator, a live project management agent (Jeeves), and two department agents that are built and waiting for rollout. Jeeves handles ClickUp work from Slack and turns website vulnerability alerts into severity-ranked summaries. In a trial, one department agent cut newspaper draft time from a week to 2 days. Each agent's tools and memory are limited to its role and company, and I keep testing those limits.</w:t>
             </w:r>
           </w:p>
           <w:p>
@@ -1182,7 +1182,7 @@
                 <w:sz w:val="17"/>
                 <w:szCs w:val="17"/>
               </w:rPr>
-              <w:t>Automated monitor for a medical client's public website and patient booking system. Twice a day it loads the main pages, makes a test booking all the way through, checks the booking gets cleaned up, and sends a report that says which step failed and who needs to fix it. It replaced about 40 minutes a day of manual checks and caught several real issues in its first months.</w:t>
+              <w:t>Automated monitor for a medical client's public website and patient booking system. Twice a day it loads the main pages, makes a test booking all the way through, checks the booking gets cleaned up, and sends a report that says which step failed and who needs to fix it. When a check fails, an LLM adds a root-cause comment. Issues it has caught include a broken booking flow, page outages and data cleanup failures.</w:t>
             </w:r>
           </w:p>
           <w:p>

</xml_diff>

<commit_message>
Portfolio and CV: agent-led wording, drop unmeasured saving, Johannesburg
Co-Authored-By: Claude Opus 5.5 <noreply@anthropic.com>
Claude-Session: https://claude.ai/code/session_01U9RezkcyVgUVHTnF6pvvS6
</commit_message>
<xml_diff>
--- a/assets/cv/David_Hill_CV.docx
+++ b/assets/cv/David_Hill_CV.docx
@@ -128,7 +128,7 @@
                 <w:sz w:val="16"/>
                 <w:szCs w:val="16"/>
               </w:rPr>
-              <w:t>Portfolio: sassblanket98.github.io</w:t>
+              <w:t>Portfolio: portfolio.automatism.co.za</w:t>
             </w:r>
           </w:p>
           <w:p>
@@ -158,22 +158,22 @@
                 <w:sz w:val="16"/>
                 <w:szCs w:val="16"/>
               </w:rPr>
-              <w:t>Johannesburg, relocating to Cape Town</w:t>
-            </w:r>
-          </w:p>
-          <w:p>
-            <w:pPr>
-              <w:spacing w:after="40"/>
-            </w:pPr>
-            <w:r>
-              <w:rPr>
-                <w:b w:val="false"/>
-                <w:bCs w:val="false"/>
-                <w:color w:val="444444"/>
-                <w:sz w:val="16"/>
-                <w:szCs w:val="16"/>
-              </w:rPr>
-              <w:t xml:space="preserve">South African Citizen</w:t>
+              <w:t>Johannesburg, South Africa</w:t>
+            </w:r>
+          </w:p>
+          <w:p>
+            <w:pPr>
+              <w:spacing w:after="40"/>
+            </w:pPr>
+            <w:r>
+              <w:rPr>
+                <w:b w:val="false"/>
+                <w:bCs w:val="false"/>
+                <w:color w:val="444444"/>
+                <w:sz w:val="16"/>
+                <w:szCs w:val="16"/>
+              </w:rPr>
+              <w:t>South African &amp; British Citizen</w:t>
             </w:r>
           </w:p>
           <w:p>
@@ -256,7 +256,7 @@
                 <w:sz w:val="16"/>
                 <w:szCs w:val="16"/>
               </w:rPr>
-              <w:t>TypeScript, JavaScript &amp; Python</w:t>
+              <w:t>AI-directed: Python, TypeScript, JS</w:t>
             </w:r>
           </w:p>
           <w:p>
@@ -543,7 +543,7 @@
                 <w:sz w:val="17"/>
                 <w:szCs w:val="17"/>
               </w:rPr>
-              <w:t>I build AI systems, automation and full-stack web apps, and I don't call them done until I've proven they work. At Neozeit I'm the front person on almost all of my development work. I run the requirements meetings with the client, build the system, and handle the training and support afterwards. I test the limits I put on AI agents instead of trusting them. I've been building with AI tools since 2022.</w:t>
+              <w:t>I direct AI agents to build AI systems, automation and full-stack web apps, and I don't call them done until I've proven they work. At Neozeit I'm the front person on almost all of my development work. I run the requirements meetings with the client, direct the AI agents that build the system, test it, and handle the training and support afterwards. I test the limits I put on AI agents instead of trusting them. I've been building with AI tools since 2022.</w:t>
             </w:r>
           </w:p>
           <w:p>
@@ -636,25 +636,25 @@
                 <w:sz w:val="17"/>
                 <w:szCs w:val="17"/>
               </w:rPr>
-              <w:t>Led the design and deployment of a multi-agent AI system (OpenClaw) for two client companies sharing an office. Two agents are live and two more are built and waiting for rollout. The live project management agent handles ClickUp task creation, assignment, status updates and summaries from Slack. It also ranks website vulnerability alerts by severity, so they now get read and forwarded to the team.</w:t>
-            </w:r>
-          </w:p>
-          <w:p>
-            <w:pPr>
-              <w:pStyle w:val="ListParagraph"/>
-              <w:numPr>
-                <w:ilvl w:val="0"/>
-                <w:numId w:val="2"/>
-              </w:numPr>
-              <w:spacing w:after="60" w:line="250"/>
-            </w:pPr>
-            <w:r>
-              <w:rPr>
-                <w:color w:val="444444"/>
-                <w:sz w:val="17"/>
-                <w:szCs w:val="17"/>
-              </w:rPr>
-              <w:t>Built a custom ClickUp MCP server in TypeScript after finding the official one didn't support OpenClaw, and put it into the client's production agent.</w:t>
+              <w:t>Led the design and deployment of a multi-agent AI system (OpenClaw) for two client companies sharing an office. Two agents are live and two more are built and waiting for rollout. The live project management agent (Jeeves) handles ClickUp task creation, assignment, status updates and summaries from Slack. It also ranks website vulnerability alerts by severity. Moving it to sequential per-project fetching fixed its ClickUp rate-limit errors.</w:t>
+            </w:r>
+          </w:p>
+          <w:p>
+            <w:pPr>
+              <w:pStyle w:val="ListParagraph"/>
+              <w:numPr>
+                <w:ilvl w:val="0"/>
+                <w:numId w:val="2"/>
+              </w:numPr>
+              <w:spacing w:after="60" w:line="250"/>
+            </w:pPr>
+            <w:r>
+              <w:rPr>
+                <w:color w:val="444444"/>
+                <w:sz w:val="17"/>
+                <w:szCs w:val="17"/>
+              </w:rPr>
+              <w:t>Delivered a custom ClickUp MCP server in TypeScript after finding the official one didn't support OpenClaw, and put it into the client's production agent.</w:t>
             </w:r>
           </w:p>
           <w:p>
@@ -690,61 +690,61 @@
                 <w:sz w:val="17"/>
                 <w:szCs w:val="17"/>
               </w:rPr>
-              <w:t>Built an automated monitor in Python and Playwright for a medical client's website and patient booking flow, replacing about 40 minutes a day of manual checks. It regularly catches real issues on the booking platform, and has exposed inconsistent per-doctor settings in the platform's backend.</w:t>
-            </w:r>
-          </w:p>
-          <w:p>
-            <w:pPr>
-              <w:pStyle w:val="ListParagraph"/>
-              <w:numPr>
-                <w:ilvl w:val="0"/>
-                <w:numId w:val="2"/>
-              </w:numPr>
-              <w:spacing w:after="60" w:line="250"/>
-            </w:pPr>
-            <w:r>
-              <w:rPr>
-                <w:color w:val="444444"/>
-                <w:sz w:val="17"/>
-                <w:szCs w:val="17"/>
-              </w:rPr>
-              <w:t>Built and shipped full-stack web apps for clients, including a field-sales mapping platform (Express, MariaDB, Leaflet, offline PWA) and a market briefing dashboard (React, Express, TypeScript, PostgreSQL).</w:t>
-            </w:r>
-          </w:p>
-          <w:p>
-            <w:pPr>
-              <w:pStyle w:val="ListParagraph"/>
-              <w:numPr>
-                <w:ilvl w:val="0"/>
-                <w:numId w:val="2"/>
-              </w:numPr>
-              <w:spacing w:after="60" w:line="250"/>
-            </w:pPr>
-            <w:r>
-              <w:rPr>
-                <w:color w:val="444444"/>
-                <w:sz w:val="17"/>
-                <w:szCs w:val="17"/>
-              </w:rPr>
-              <w:t>Built shell-script automation for update and patch management across a client's macOS fleet of roughly 160 devices.</w:t>
-            </w:r>
-          </w:p>
-          <w:p>
-            <w:pPr>
-              <w:pStyle w:val="ListParagraph"/>
-              <w:numPr>
-                <w:ilvl w:val="0"/>
-                <w:numId w:val="2"/>
-              </w:numPr>
-              <w:spacing w:after="60" w:line="250"/>
-            </w:pPr>
-            <w:r>
-              <w:rPr>
-                <w:color w:val="444444"/>
-                <w:sz w:val="17"/>
-                <w:szCs w:val="17"/>
-              </w:rPr>
-              <w:t>Sole operator of Neozeit's Proxmox VE infrastructure (3-node cluster, RAID6 backup server). Built the cluster from scratch and moved production VMs onto it while they stayed in use.</w:t>
+              <w:t>Delivered an automated monitor in Python and Playwright for a medical client's website and patient booking flow. It runs twice a day, sends Telegram reports and has caught real issues on the booking platform, including inconsistent per-doctor settings in the platform's backend.</w:t>
+            </w:r>
+          </w:p>
+          <w:p>
+            <w:pPr>
+              <w:pStyle w:val="ListParagraph"/>
+              <w:numPr>
+                <w:ilvl w:val="0"/>
+                <w:numId w:val="2"/>
+              </w:numPr>
+              <w:spacing w:after="60" w:line="250"/>
+            </w:pPr>
+            <w:r>
+              <w:rPr>
+                <w:color w:val="444444"/>
+                <w:sz w:val="17"/>
+                <w:szCs w:val="17"/>
+              </w:rPr>
+              <w:t>Delivered and shipped full-stack web apps for clients, including a field-sales mapping platform (Express, MariaDB, Leaflet, offline PWA) and a market briefing dashboard (React, Express, TypeScript, PostgreSQL).</w:t>
+            </w:r>
+          </w:p>
+          <w:p>
+            <w:pPr>
+              <w:pStyle w:val="ListParagraph"/>
+              <w:numPr>
+                <w:ilvl w:val="0"/>
+                <w:numId w:val="2"/>
+              </w:numPr>
+              <w:spacing w:after="60" w:line="250"/>
+            </w:pPr>
+            <w:r>
+              <w:rPr>
+                <w:color w:val="444444"/>
+                <w:sz w:val="17"/>
+                <w:szCs w:val="17"/>
+              </w:rPr>
+              <w:t>Delivered shell-script automation for update and patch management across a client's macOS fleet of roughly 160 devices.</w:t>
+            </w:r>
+          </w:p>
+          <w:p>
+            <w:pPr>
+              <w:pStyle w:val="ListParagraph"/>
+              <w:numPr>
+                <w:ilvl w:val="0"/>
+                <w:numId w:val="2"/>
+              </w:numPr>
+              <w:spacing w:after="60" w:line="250"/>
+            </w:pPr>
+            <w:r>
+              <w:rPr>
+                <w:color w:val="444444"/>
+                <w:sz w:val="17"/>
+                <w:szCs w:val="17"/>
+              </w:rPr>
+              <w:t>Primary operator of Neozeit's Proxmox VE infrastructure (3-node cluster, RAID6 backup server). Built the cluster from scratch and moved production VMs onto it while they stayed in use.</w:t>
             </w:r>
           </w:p>
           <w:p>
@@ -1139,7 +1139,7 @@
                 <w:sz w:val="17"/>
                 <w:szCs w:val="17"/>
               </w:rPr>
-              <w:t>Vantage Point · Anonymised Client Demo</w:t>
+              <w:t>model-ladder · Public Benchmark Tooling</w:t>
             </w:r>
           </w:p>
           <w:p>
@@ -1153,7 +1153,7 @@
                 <w:sz w:val="17"/>
                 <w:szCs w:val="17"/>
               </w:rPr>
-              <w:t>Competitive-intelligence dashboard for a cybersecurity vendor, with an AI-filtered news feed, a competitor tracker, a content writer and an outreach CRM behind one login. Competitor and company research runs through a ReAct-style agent loop I wrote directly against the Anthropic Messages API, with no framework, and each tool call and result streams to the browser live. The news summariser and content writer stream their output as it's generated. React, TypeScript, Fastify, Prisma, PostgreSQL. The public demo is frontend only and runs on sample data.</w:t>
+              <w:t>Open-source CLI that runs coding agents on tasks with hidden acceptance tests and reference solutions, to show which model and reasoning effort can handle each kind of job. It includes a catalogue MCP server and a task that only passes when the agent makes every required tool call as well as fixing the code. A companion repo, local-llm-bench, scores local models on 14 code-graded tasks. Both were built with AI coding agents under my direction. github.com/SassBlanket98/model-ladder</w:t>
             </w:r>
           </w:p>
           <w:p>
@@ -1168,7 +1168,7 @@
                 <w:sz w:val="17"/>
                 <w:szCs w:val="17"/>
               </w:rPr>
-              <w:t>Website &amp; Booking Monitor · Medical Client</w:t>
+              <w:t>Vantage Point · Anonymised Client Demo</w:t>
             </w:r>
           </w:p>
           <w:p>
@@ -1182,7 +1182,7 @@
                 <w:sz w:val="17"/>
                 <w:szCs w:val="17"/>
               </w:rPr>
-              <w:t>Automated monitor for a medical client's public website and patient booking system. Twice a day it loads the main pages, makes a test booking all the way through, checks the booking gets cleaned up, and sends a report that says which step failed and who needs to fix it. When a check fails, an LLM adds a root-cause comment. Issues it has caught include a broken booking flow, page outages and data cleanup failures.</w:t>
+              <w:t>Competitive-intelligence dashboard for a cybersecurity vendor, with an AI-filtered news feed, a competitor tracker, a content writer and an outreach CRM behind one login. Competitor and company research runs through a ReAct-style agent loop that I had an AI agent write against the Anthropic Messages API, with no framework, and each tool call and result streams to the browser live. The news summariser and content writer stream their output as it's generated. React, TypeScript, Fastify, Prisma, PostgreSQL. The public demo is frontend only and runs on sample data.</w:t>
             </w:r>
           </w:p>
           <w:p>
@@ -1197,7 +1197,7 @@
                 <w:sz w:val="17"/>
                 <w:szCs w:val="17"/>
               </w:rPr>
-              <w:t>Field-Sales Mapping Platform · Anonymised Client Work</w:t>
+              <w:t>Website &amp; Booking Monitor · Medical Client</w:t>
             </w:r>
           </w:p>
           <w:p>
@@ -1211,7 +1211,7 @@
                 <w:sz w:val="17"/>
                 <w:szCs w:val="17"/>
               </w:rPr>
-              <w:t>Map of doctors, medical centres and rep territories for a healthcare sales team, with an admin dashboard, automated daily reports and a mobile PWA that queues changes offline and syncs when signal returns. Territory permissions are enforced on the server as well as in the browser. Node.js, Express, Sequelize, MariaDB and Leaflet, with TOTP 2FA and a React Native companion app.</w:t>
+              <w:t>Automated monitor for a medical client's public website and patient booking system. Twice a day it loads the main pages, makes a test booking all the way through, checks the booking gets cleaned up, and sends a Telegram report that says which step failed and who needs to fix it. When a check fails, an LLM adds a root-cause comment. Issues it has caught include a broken booking flow, page outages and data cleanup failures.</w:t>
             </w:r>
           </w:p>
           <w:p>
@@ -1226,7 +1226,7 @@
                 <w:sz w:val="17"/>
                 <w:szCs w:val="17"/>
               </w:rPr>
-              <w:t>Market Briefing Dashboard · Anonymised Client Work</w:t>
+              <w:t>Field-Sales Mapping Platform · Anonymised Client Work</w:t>
             </w:r>
           </w:p>
           <w:p>
@@ -1240,7 +1240,7 @@
                 <w:sz w:val="17"/>
                 <w:szCs w:val="17"/>
               </w:rPr>
-              <w:t>Daily briefing tool for a financial advisory practice. It pulls market data and regional news, lets an operator review the articles, and sends a formatted briefing to the firm's Telegram channel. It started as a Flask prototype and I rebuilt it in React, Express, TypeScript and PostgreSQL with JWT and TOTP auth, Jest tests and GitHub Actions CI.</w:t>
+              <w:t>Map of doctors, medical centres and rep territories for a healthcare sales team, with an admin dashboard, automated daily reports and a mobile PWA that queues changes offline and syncs when signal returns. Territory permissions are enforced on the server as well as in the browser. Node.js, Express, Sequelize, MariaDB and Leaflet, with TOTP 2FA and a React Native companion app.</w:t>
             </w:r>
           </w:p>
           <w:p>
@@ -1255,7 +1255,7 @@
                 <w:sz w:val="17"/>
                 <w:szCs w:val="17"/>
               </w:rPr>
-              <w:t>Personal AI Stack · Self-Hosted Personal Project</w:t>
+              <w:t>Market Briefing Dashboard · Anonymised Client Work</w:t>
             </w:r>
           </w:p>
           <w:p>
@@ -1269,7 +1269,7 @@
                 <w:sz w:val="17"/>
                 <w:szCs w:val="17"/>
               </w:rPr>
-              <w:t>Self-hosted multi-agent setup for personal research, planning and day-to-day automation, built on OpenClaw. One agent runs on an OpenAI Codex subscription and two run on OpenRouter models. Memory is MemPalace (open source), with my own diary and checkpoint workflows on top. Each agent has its own scoped memory and toolset.</w:t>
+              <w:t>Daily briefing tool for a financial advisory practice. It pulls market data and regional news, lets an operator review the articles, and sends a formatted briefing to the firm's Telegram channel. It started as a Flask prototype and I directed its rebuild in React, Express, TypeScript and PostgreSQL with JWT and TOTP auth, Jest tests and GitHub Actions CI.</w:t>
             </w:r>
           </w:p>
           <w:p>
@@ -1284,7 +1284,7 @@
                 <w:sz w:val="17"/>
                 <w:szCs w:val="17"/>
               </w:rPr>
-              <w:t>HillSkills.co.za · Public Production Site</w:t>
+              <w:t>Personal AI Stack · Self-Hosted Personal Project</w:t>
             </w:r>
           </w:p>
           <w:p>
@@ -1298,7 +1298,36 @@
                 <w:sz w:val="17"/>
                 <w:szCs w:val="17"/>
               </w:rPr>
-              <w:t>Named, live site built end to end for a PMBIA-certified mountain bike coaching business, still hosted and managed personally. Static HTML/CSS/JS front end with a PHP contact form that sends mail over the Microsoft Graph API, since shared hosting blocks outbound SMTP.</w:t>
+              <w:t>Self-hosted multi-agent setup for personal research, planning and day-to-day automation, built on OpenClaw. One agent runs on an OpenAI Codex subscription and two run on OpenRouter models. Memory is MemPalace (open source), with my own diary and checkpoint workflows on top. Each agent has its own scoped memory and toolset.</w:t>
+            </w:r>
+          </w:p>
+          <w:p>
+            <w:pPr>
+              <w:spacing w:after="50" w:before="150"/>
+            </w:pPr>
+            <w:r>
+              <w:rPr>
+                <w:b/>
+                <w:bCs/>
+                <w:color w:val="1F3552"/>
+                <w:sz w:val="17"/>
+                <w:szCs w:val="17"/>
+              </w:rPr>
+              <w:t>HillSkills.co.za · Public Production Site</w:t>
+            </w:r>
+          </w:p>
+          <w:p>
+            <w:pPr>
+              <w:spacing w:after="90" w:line="250"/>
+              <w:jc w:val="left"/>
+            </w:pPr>
+            <w:r>
+              <w:rPr>
+                <w:color w:val="444444"/>
+                <w:sz w:val="17"/>
+                <w:szCs w:val="17"/>
+              </w:rPr>
+              <w:t>Named, live site delivered end to end for a PMBIA-certified mountain bike coaching business, still hosted and managed personally. Static HTML/CSS/JS front end with a PHP contact form that sends mail over the Microsoft Graph API, since shared hosting blocks outbound SMTP.</w:t>
             </w:r>
           </w:p>
           <w:p>
@@ -1353,7 +1382,7 @@
                 <w:sz w:val="17"/>
                 <w:szCs w:val="17"/>
               </w:rPr>
-              <w:t>Self-studied Python, JavaScript, TypeScript, HTML and CSS through hands-on project work.</w:t>
+              <w:t>Developed Python, JavaScript, TypeScript, HTML and CSS projects using AI coding agents, with hands-on testing and troubleshooting.</w:t>
             </w:r>
           </w:p>
           <w:p>

</xml_diff>

<commit_message>
Correct CV and portfolio project claims
</commit_message>
<xml_diff>
--- a/assets/cv/David_Hill_CV.docx
+++ b/assets/cv/David_Hill_CV.docx
@@ -543,7 +543,7 @@
                 <w:sz w:val="17"/>
                 <w:szCs w:val="17"/>
               </w:rPr>
-              <w:t>I direct AI agents to build AI systems, automation and full-stack web apps, and I don't call them done until I've proven they work. At Neozeit I'm the front person on almost all of my development work. I run the requirements meetings with the client, direct the AI agents that build the system, test it, and handle the training and support afterwards. I test the limits I put on AI agents instead of trusting them. I've been building with AI tools since 2022.</w:t>
+              <w:t>I direct AI agents to build AI systems, automation and full-stack web apps, and I don't call them done until I've proven they work. At Neozeit I'm the front person on almost all of my development work. I run the requirements meetings with the client, direct the AI agents that build the system, test it, and handle the training and support afterwards. I test the limits I put on AI agents instead of trusting them. I've been building with AI tools since ChatGPT's launch in late 2022.</w:t>
             </w:r>
           </w:p>
           <w:p>
@@ -585,7 +585,7 @@
                 <w:sz w:val="15"/>
                 <w:szCs w:val="15"/>
               </w:rPr>
-              <w:t xml:space="preserve">   Nov 2023 – Present</w:t>
+              <w:t xml:space="preserve">   Dec 2023 – Present</w:t>
             </w:r>
           </w:p>
           <w:p>
@@ -636,7 +636,7 @@
                 <w:sz w:val="17"/>
                 <w:szCs w:val="17"/>
               </w:rPr>
-              <w:t>Led the design and deployment of a multi-agent AI system (OpenClaw) for two client companies sharing an office. Two agents are live and two more are built and waiting for rollout. The live project management agent (Jeeves) handles ClickUp task creation, assignment, status updates and summaries from Slack. It also ranks website vulnerability alerts by severity. Moving it to sequential per-project fetching fixed its ClickUp rate-limit errors.</w:t>
+              <w:t>Led the design and deployment of an OpenClaw multi-agent gateway for a client workspace and an internal studio. Orchestrator and Jeeves are deployed; two department agents are built and paused pending rollout. Jeeves handles ClickUp tasks and summaries from Slack, and ranks website vulnerability alerts by severity. The MCP server caps concurrent requests and backs off on HTTP 429 responses.</w:t>
             </w:r>
           </w:p>
           <w:p>
@@ -672,43 +672,43 @@
                 <w:sz w:val="17"/>
                 <w:szCs w:val="17"/>
               </w:rPr>
-              <w:t>Set up tiered model use to keep costs down: a stronger model (currently GPT-6 Sol) plans and reviews, a cheaper one (GPT-6 Luna) does routine execution and scheduled jobs, and plain scripts handle bulk data work. Models are set in gateway config, so changing provider didn't need a rebuild.</w:t>
-            </w:r>
-          </w:p>
-          <w:p>
-            <w:pPr>
-              <w:pStyle w:val="ListParagraph"/>
-              <w:numPr>
-                <w:ilvl w:val="0"/>
-                <w:numId w:val="2"/>
-              </w:numPr>
-              <w:spacing w:after="60" w:line="250"/>
-            </w:pPr>
-            <w:r>
-              <w:rPr>
-                <w:color w:val="444444"/>
-                <w:sz w:val="17"/>
-                <w:szCs w:val="17"/>
-              </w:rPr>
-              <w:t>Delivered an automated monitor in Python and Playwright for a medical client's website and patient booking flow. It runs twice a day, sends Telegram reports and has caught real issues on the booking platform, including inconsistent per-doctor settings in the platform's backend.</w:t>
-            </w:r>
-          </w:p>
-          <w:p>
-            <w:pPr>
-              <w:pStyle w:val="ListParagraph"/>
-              <w:numPr>
-                <w:ilvl w:val="0"/>
-                <w:numId w:val="2"/>
-              </w:numPr>
-              <w:spacing w:after="60" w:line="250"/>
-            </w:pPr>
-            <w:r>
-              <w:rPr>
-                <w:color w:val="444444"/>
-                <w:sz w:val="17"/>
-                <w:szCs w:val="17"/>
-              </w:rPr>
-              <w:t>Delivered and shipped full-stack web apps for clients, including a field-sales mapping platform (Express, MariaDB, Leaflet, offline PWA) and a market briefing dashboard (React, Express, TypeScript, PostgreSQL).</w:t>
+              <w:t>Configure model routing and fallback providers in OpenClaw, with plain scripts handling deterministic bulk data work. The gateway uses GLM-5.2 with a Kimi-K3 fallback. A separate booking-monitor failure investigator uses a different model and enforces a monthly run cap.</w:t>
+            </w:r>
+          </w:p>
+          <w:p>
+            <w:pPr>
+              <w:pStyle w:val="ListParagraph"/>
+              <w:numPr>
+                <w:ilvl w:val="0"/>
+                <w:numId w:val="2"/>
+              </w:numPr>
+              <w:spacing w:after="60" w:line="250"/>
+            </w:pPr>
+            <w:r>
+              <w:rPr>
+                <w:color w:val="444444"/>
+                <w:sz w:val="17"/>
+                <w:szCs w:val="17"/>
+              </w:rPr>
+              <w:t>Delivered an automated monitor in Python and Playwright for a medical client's website and patient booking flow. It runs twice a day, sends Telegram reports and has caught real issues on the booking platform, including failed booking and cancellation steps.</w:t>
+            </w:r>
+          </w:p>
+          <w:p>
+            <w:pPr>
+              <w:pStyle w:val="ListParagraph"/>
+              <w:numPr>
+                <w:ilvl w:val="0"/>
+                <w:numId w:val="2"/>
+              </w:numPr>
+              <w:spacing w:after="60" w:line="250"/>
+            </w:pPr>
+            <w:r>
+              <w:rPr>
+                <w:color w:val="444444"/>
+                <w:sz w:val="17"/>
+                <w:szCs w:val="17"/>
+              </w:rPr>
+              <w:t>Delivered a live field-sales mapping platform (JavaScript, Express, MariaDB, Leaflet, offline PWA). Also directed the build of a market briefing dashboard (React, Express, TypeScript, PostgreSQL), approved by the client and awaiting launch.</w:t>
             </w:r>
           </w:p>
           <w:p>
@@ -744,7 +744,7 @@
                 <w:sz w:val="17"/>
                 <w:szCs w:val="17"/>
               </w:rPr>
-              <w:t>Primary operator of Neozeit's Proxmox VE infrastructure (3-node cluster, RAID6 backup server). Built the cluster from scratch and moved production VMs onto it while they stayed in use.</w:t>
+              <w:t>Installed Neozeit's three-node Proxmox VE cluster from a colleague's design in 2025 and have operated it since, including VM migrations and a RAID6 backup server.</w:t>
             </w:r>
           </w:p>
           <w:p>
@@ -1025,6 +1025,8 @@
           </w:p>
           <w:p>
             <w:pPr>
+              <w:keepNext/>
+              <w:pageBreakBefore/>
               <w:spacing w:after="10" w:before="180"/>
             </w:pPr>
             <w:r>
@@ -1048,6 +1050,7 @@
           </w:p>
           <w:p>
             <w:pPr>
+              <w:keepNext/>
               <w:spacing w:after="90"/>
             </w:pPr>
             <w:r>
@@ -1124,7 +1127,7 @@
                 <w:sz w:val="17"/>
                 <w:szCs w:val="17"/>
               </w:rPr>
-              <w:t>Multi-agent deployment on OpenClaw for two client companies sharing one gateway: a live Orchestrator, a live project management agent (Jeeves), and two department agents that are built and waiting for rollout. Jeeves handles ClickUp work from Slack and turns website vulnerability alerts into severity-ranked summaries. In a trial, one department agent cut newspaper draft time from a week to 2 days. Each agent's tools and memory are limited to its role and company, and I keep testing those limits.</w:t>
+              <w:t>OpenClaw gateway with a client workspace and an internal studio. Orchestrator and Jeeves are deployed; two department agents are built and paused pending rollout. Jeeves handles ClickUp tasks from Slack and summarises website vulnerability alerts. The custom TypeScript MCP server has 18 tools, capped request concurrency and HTTP 429 backoff. Agent tools and memory are scoped by role, and I keep testing those limits.</w:t>
             </w:r>
           </w:p>
           <w:p>
@@ -1153,7 +1156,7 @@
                 <w:sz w:val="17"/>
                 <w:szCs w:val="17"/>
               </w:rPr>
-              <w:t>Open-source CLI that runs coding agents on tasks with hidden acceptance tests and reference solutions, to show which model and reasoning effort can handle each kind of job. It includes a catalogue MCP server and a task that only passes when the agent makes every required tool call as well as fixing the code. A companion repo, local-llm-bench, scores local models on 14 code-graded tasks. Both were built with AI coding agents under my direction. github.com/SassBlanket98/model-ladder</w:t>
+              <w:t>Open-source CLI that runs coding agents on tasks with held-out acceptance tests copied in after the agent finishes, and reference solutions, to show which model and reasoning effort can handle each kind of job. It includes a catalogue MCP server and a task that only passes when the agent makes every required tool call as well as fixing the code. A companion repo, local-llm-bench, scores local models on 14 code-graded tasks, with held-out tests for its bug-fix task and seven replay briefs. Both were built with AI coding agents under my direction. github.com/SassBlanket98/model-ladder</w:t>
             </w:r>
           </w:p>
           <w:p>
@@ -1182,7 +1185,7 @@
                 <w:sz w:val="17"/>
                 <w:szCs w:val="17"/>
               </w:rPr>
-              <w:t>Competitive-intelligence dashboard for a cybersecurity vendor, with an AI-filtered news feed, a competitor tracker, a content writer and an outreach CRM behind one login. Competitor and company research runs through a ReAct-style agent loop that I had an AI agent write against the Anthropic Messages API, with no framework, and each tool call and result streams to the browser live. The news summariser and content writer stream their output as it's generated. React, TypeScript, Fastify, Prisma, PostgreSQL. The public demo is frontend only and runs on sample data.</w:t>
+              <w:t>Competitive-intelligence dashboard in beta for a cybersecurity vendor, with an AI-filtered news feed, a competitor tracker, a content writer and an outreach CRM behind one login. Competitor and company research runs through a tool-use loop that I had an AI agent write against the Anthropic Messages API, with no framework, and each tool call and result streams to the browser live. The news summariser and content writer stream their output as it's generated. React, TypeScript, Fastify, Prisma, PostgreSQL. The public demo is frontend only and runs on sample data.</w:t>
             </w:r>
           </w:p>
           <w:p>
@@ -1240,7 +1243,7 @@
                 <w:sz w:val="17"/>
                 <w:szCs w:val="17"/>
               </w:rPr>
-              <w:t>Map of doctors, medical centres and rep territories for a healthcare sales team, with an admin dashboard, automated daily reports and a mobile PWA that queues changes offline and syncs when signal returns. Territory permissions are enforced on the server as well as in the browser. Node.js, Express, Sequelize, MariaDB and Leaflet, with TOTP 2FA and a React Native companion app.</w:t>
+              <w:t>Map of doctors, medical centres and rep territories for a healthcare sales team, with an admin dashboard, automated daily reports and a mobile PWA that queues changes offline and syncs when signal returns. Territory permissions are enforced on the server as well as in the browser. Node.js, Express, Sequelize, MariaDB and Leaflet, with session-cookie login, TOTP 2FA and a React Native companion app.</w:t>
             </w:r>
           </w:p>
           <w:p>
@@ -1269,7 +1272,7 @@
                 <w:sz w:val="17"/>
                 <w:szCs w:val="17"/>
               </w:rPr>
-              <w:t>Daily briefing tool for a financial advisory practice. It pulls market data and regional news, lets an operator review the articles, and sends a formatted briefing to the firm's Telegram channel. It started as a Flask prototype and I directed its rebuild in React, Express, TypeScript and PostgreSQL with JWT and TOTP auth, Jest tests and GitHub Actions CI.</w:t>
+              <w:t>Client-approved daily briefing tool for a financial advisory practice, awaiting launch. It pulls market data and regional news, lets an operator review the articles, and sends a formatted briefing to the firm's Telegram channel. It started as a Flask prototype and I directed its rebuild in React, Express, TypeScript and PostgreSQL with JWT and TOTP auth, Jest tests and GitHub Actions CI.</w:t>
             </w:r>
           </w:p>
           <w:p>
@@ -1298,7 +1301,7 @@
                 <w:sz w:val="17"/>
                 <w:szCs w:val="17"/>
               </w:rPr>
-              <w:t>Self-hosted multi-agent setup for personal research, planning and day-to-day automation, built on OpenClaw. One agent runs on an OpenAI Codex subscription and two run on OpenRouter models. Memory is MemPalace (open source), with my own diary and checkpoint workflows on top. Each agent has its own scoped memory and toolset.</w:t>
+              <w:t>Self-hosted OpenClaw agents for personal research, planning and automation, with role-scoped tools and memory. My MemPalace-based agents use diary and checkpoint workflows I added. Separately, Onyx uses a local 9B chat model with a hosted router and relevance judge. Messages go to those hosted services; notes marked private are withheld from both.</w:t>
             </w:r>
           </w:p>
           <w:p>
@@ -1364,7 +1367,7 @@
                 <w:sz w:val="17"/>
                 <w:szCs w:val="17"/>
               </w:rPr>
-              <w:t>Began coding with AI assistance in 2022, using early-generation LLMs in a manual prompt-and-paste workflow. Now works regularly with modern AI development tooling including Claude Code and Cursor.</w:t>
+              <w:t>Began coding with AI assistance after ChatGPT's launch in late 2022, using a manual prompt-and-paste workflow. Now works regularly with modern AI development tooling including Claude Code and Cursor.</w:t>
             </w:r>
           </w:p>
           <w:p>
@@ -1383,42 +1386,6 @@
                 <w:szCs w:val="17"/>
               </w:rPr>
               <w:t>Developed Python, JavaScript, TypeScript, HTML and CSS projects using AI coding agents, with hands-on testing and troubleshooting.</w:t>
-            </w:r>
-          </w:p>
-          <w:p>
-            <w:pPr>
-              <w:pStyle w:val="ListParagraph"/>
-              <w:numPr>
-                <w:ilvl w:val="0"/>
-                <w:numId w:val="2"/>
-              </w:numPr>
-              <w:spacing w:after="60" w:line="250"/>
-            </w:pPr>
-            <w:r>
-              <w:rPr>
-                <w:color w:val="444444"/>
-                <w:sz w:val="17"/>
-                <w:szCs w:val="17"/>
-              </w:rPr>
-              <w:t xml:space="preserve">Built service health monitoring scripts with automated alerting for personal web services.</w:t>
-            </w:r>
-          </w:p>
-          <w:p>
-            <w:pPr>
-              <w:pStyle w:val="ListParagraph"/>
-              <w:numPr>
-                <w:ilvl w:val="0"/>
-                <w:numId w:val="2"/>
-              </w:numPr>
-              <w:spacing w:after="60" w:line="250"/>
-            </w:pPr>
-            <w:r>
-              <w:rPr>
-                <w:color w:val="444444"/>
-                <w:sz w:val="17"/>
-                <w:szCs w:val="17"/>
-              </w:rPr>
-              <w:t xml:space="preserve">Developed data-fetching and categorisation scripts to organise and process structured datasets.</w:t>
             </w:r>
           </w:p>
           <w:p>

</xml_diff>